<commit_message>
Correcting contract details and recalculating distances accurately (6aca7bb56b312796108930ff)
</commit_message>
<xml_diff>
--- a/contract/dogovor-shablon.docx
+++ b/contract/dogovor-shablon.docx
@@ -45,6 +45,7 @@
     </w:p>
     <w:p>
       <w:pPr>
+        <w:keepNext/>
         <w:rPr>
           <w:b w:val="1"/>
           <w:bCs w:val="1"/>
@@ -61,6 +62,7 @@
     </w:p>
     <w:p>
       <w:pPr>
+        <w:keepNext/>
         <w:rPr>
           <w:b w:val="1"/>
           <w:bCs w:val="1"/>
@@ -175,6 +177,7 @@
     </w:p>
     <w:p>
       <w:pPr>
+        <w:keepNext/>
         <w:rPr>
           <w:b w:val="1"/>
           <w:bCs w:val="1"/>
@@ -197,9 +200,9 @@
         <w:rPr>
           <w:rtl w:val="0"/>
         </w:rPr>
-        <w:t xml:space="preserve">{{name}}, ЕГН/ЛНЧ: {{egn}},</w:t>
+        <w:t xml:space="preserve">{{name}},</w:t>
         <w:br w:type="textWrapping"/>
-        <w:t xml:space="preserve"/>
+        <w:t xml:space="preserve">ЕГН/ЛНЧ: {{egn}},</w:t>
       </w:r>
     </w:p>
     <w:p>
@@ -222,44 +225,32 @@
           <w:rtl w:val="0"/>
         </w:rPr>
         <w:t xml:space="preserve">АДРЕС: {{address}},</w:t>
+      </w:r>
+    </w:p>
+    <w:p>
+      <w:pPr>
+        <w:rPr/>
+      </w:pPr>
+      <w:r>
+        <w:rPr>
+          <w:rtl w:val="0"/>
+        </w:rPr>
+        <w:t xml:space="preserve">{{idLabel}} № {{idn}},</w:t>
         <w:br w:type="textWrapping"/>
-        <w:t xml:space="preserve"/>
+        <w:t xml:space="preserve">{{idIssued}} на {{idd}} г. от {{idp}},</w:t>
+      </w:r>
+    </w:p>
+    <w:p>
+      <w:pPr>
+        <w:rPr/>
+      </w:pPr>
+      <w:r>
+        <w:rPr>
+          <w:rtl w:val="0"/>
+        </w:rPr>
+        <w:t xml:space="preserve">СУМПС № {{dln}},</w:t>
         <w:br w:type="textWrapping"/>
-        <w:t xml:space="preserve"/>
-        <w:br w:type="textWrapping"/>
-        <w:t xml:space="preserve"/>
-        <w:br w:type="textWrapping"/>
-        <w:t xml:space="preserve"/>
-        <w:br w:type="textWrapping"/>
-        <w:t xml:space="preserve"/>
-        <w:br w:type="textWrapping"/>
-        <w:t xml:space="preserve"/>
-      </w:r>
-    </w:p>
-    <w:p>
-      <w:pPr>
-        <w:rPr/>
-      </w:pPr>
-      <w:r>
-        <w:rPr>
-          <w:rtl w:val="0"/>
-        </w:rPr>
-        <w:t xml:space="preserve">{{idLabel}} № {{idn}}, {{idIssued}} на {{idd}} г. от {{idp}},</w:t>
-        <w:br w:type="textWrapping"/>
-        <w:t xml:space="preserve"/>
-      </w:r>
-    </w:p>
-    <w:p>
-      <w:pPr>
-        <w:rPr/>
-      </w:pPr>
-      <w:r>
-        <w:rPr>
-          <w:rtl w:val="0"/>
-        </w:rPr>
-        <w:t xml:space="preserve">СУМПС № {{dln}}, издадено на {{dld}} г. от {{dlp}},</w:t>
-        <w:br w:type="textWrapping"/>
-        <w:t xml:space="preserve"/>
+        <w:t xml:space="preserve">издадено на {{dld}} г. от {{dlp}},</w:t>
       </w:r>
     </w:p>
     <w:p>
@@ -299,6 +290,7 @@
     </w:p>
     <w:p>
       <w:pPr>
+        <w:keepNext/>
         <w:rPr>
           <w:b w:val="1"/>
           <w:bCs w:val="1"/>
@@ -315,6 +307,7 @@
     </w:p>
     <w:p>
       <w:pPr>
+        <w:keepNext/>
         <w:rPr>
           <w:b w:val="1"/>
           <w:bCs w:val="1"/>
@@ -358,18 +351,7 @@
           <w:bCs w:val="1"/>
           <w:rtl w:val="0"/>
         </w:rPr>
-        <w:t xml:space="preserve">Марка / Модел:  </w:t>
-      </w:r>
-      <w:r>
-        <w:rPr>
-          <w:rtl w:val="0"/>
-        </w:rPr>
-        <w:t xml:space="preserve">{{carModel}}</w:t>
-      </w:r>
-      <w:r>
-        <w:rPr>
-          <w:rtl w:val="0"/>
-        </w:rPr>
+        <w:t xml:space="preserve">Марка / Модел: {{carModel}}</w:t>
       </w:r>
     </w:p>
     <w:p>
@@ -390,18 +372,7 @@
           <w:bCs w:val="1"/>
           <w:rtl w:val="0"/>
         </w:rPr>
-        <w:t xml:space="preserve">Регистрационен номер: </w:t>
-      </w:r>
-      <w:r>
-        <w:rPr>
-          <w:rtl w:val="0"/>
-        </w:rPr>
-        <w:t xml:space="preserve">{{carReg}}</w:t>
-      </w:r>
-      <w:r>
-        <w:rPr>
-          <w:rtl w:val="0"/>
-        </w:rPr>
+        <w:t xml:space="preserve">Регистрационен номер: {{carReg}}</w:t>
       </w:r>
     </w:p>
     <w:p>
@@ -422,18 +393,7 @@
           <w:bCs w:val="1"/>
           <w:rtl w:val="0"/>
         </w:rPr>
-        <w:t xml:space="preserve">VIN: </w:t>
-      </w:r>
-      <w:r>
-        <w:rPr>
-          <w:rtl w:val="0"/>
-        </w:rPr>
-        <w:t xml:space="preserve">{{carVin}}</w:t>
-      </w:r>
-      <w:r>
-        <w:rPr>
-          <w:rtl w:val="0"/>
-        </w:rPr>
+        <w:t xml:space="preserve">VIN: {{carVin}}</w:t>
       </w:r>
     </w:p>
     <w:p>
@@ -454,18 +414,7 @@
           <w:bCs w:val="1"/>
           <w:rtl w:val="0"/>
         </w:rPr>
-        <w:t xml:space="preserve">Гориво: </w:t>
-      </w:r>
-      <w:r>
-        <w:rPr>
-          <w:rtl w:val="0"/>
-        </w:rPr>
-        <w:t xml:space="preserve">{{carFuel}}</w:t>
-      </w:r>
-      <w:r>
-        <w:rPr>
-          <w:rtl w:val="0"/>
-        </w:rPr>
+        <w:t xml:space="preserve">Гориво: {{carFuel}}</w:t>
       </w:r>
     </w:p>
     <w:p>
@@ -486,35 +435,25 @@
           <w:bCs w:val="1"/>
           <w:rtl w:val="0"/>
         </w:rPr>
-        <w:t xml:space="preserve">Цвят: </w:t>
-      </w:r>
-      <w:r>
-        <w:rPr>
-          <w:rtl w:val="0"/>
-        </w:rPr>
-        <w:t xml:space="preserve">{{carColor}}</w:t>
-      </w:r>
-      <w:r>
-        <w:rPr>
-          <w:rtl w:val="0"/>
-        </w:rPr>
-      </w:r>
-    </w:p>
-    <w:p>
-      <w:pPr>
-        <w:rPr>
-          <w:b w:val="1"/>
-          <w:bCs w:val="1"/>
-        </w:rPr>
-      </w:pPr>
-      <w:r>
-        <w:rPr>
-          <w:rtl w:val="0"/>
-        </w:rPr>
-      </w:r>
-    </w:p>
-    <w:p>
-      <w:pPr>
+        <w:t xml:space="preserve">Цвят: {{carColor}}</w:t>
+      </w:r>
+    </w:p>
+    <w:p>
+      <w:pPr>
+        <w:rPr>
+          <w:b w:val="1"/>
+          <w:bCs w:val="1"/>
+        </w:rPr>
+      </w:pPr>
+      <w:r>
+        <w:rPr>
+          <w:rtl w:val="0"/>
+        </w:rPr>
+      </w:r>
+    </w:p>
+    <w:p>
+      <w:pPr>
+        <w:keepNext/>
         <w:rPr>
           <w:b w:val="1"/>
           <w:bCs w:val="1"/>
@@ -531,6 +470,7 @@
     </w:p>
     <w:p>
       <w:pPr>
+        <w:keepNext/>
         <w:rPr>
           <w:b w:val="1"/>
           <w:bCs w:val="1"/>
@@ -554,67 +494,50 @@
           <w:rtl w:val="0"/>
         </w:rPr>
         <w:t xml:space="preserve">Договорът се сключва за срок от {{period}},</w:t>
+      </w:r>
+    </w:p>
+    <w:p>
+      <w:pPr>
+        <w:rPr/>
+      </w:pPr>
+      <w:r>
+        <w:rPr>
+          <w:rtl w:val="0"/>
+        </w:rPr>
+        <w:t xml:space="preserve">считано от {{startDate}} г.,</w:t>
         <w:br w:type="textWrapping"/>
-        <w:t xml:space="preserve"/>
-      </w:r>
-    </w:p>
-    <w:p>
-      <w:pPr>
-        <w:rPr/>
-      </w:pPr>
-      <w:r>
-        <w:rPr>
-          <w:rtl w:val="0"/>
-        </w:rPr>
-        <w:t xml:space="preserve">считано от {{start}},</w:t>
-      </w:r>
-      <w:r>
-        <w:rPr>
-          <w:b w:val="1"/>
-          <w:bCs w:val="1"/>
-          <w:i w:val="1"/>
-          <w:iCs w:val="1"/>
-          <w:rtl w:val="0"/>
-        </w:rPr>
-        <w:t xml:space="preserve"/>
-      </w:r>
-      <w:r>
-        <w:rPr>
-          <w:rtl w:val="0"/>
-        </w:rPr>
-        <w:t xml:space="preserve"/>
+        <w:t xml:space="preserve">{{startTime}},</w:t>
+      </w:r>
+    </w:p>
+    <w:p>
+      <w:pPr>
+        <w:rPr/>
+      </w:pPr>
+      <w:r>
+        <w:rPr>
+          <w:rtl w:val="0"/>
+        </w:rPr>
+        <w:t xml:space="preserve">до {{endDate}} г.,</w:t>
         <w:br w:type="textWrapping"/>
-        <w:t xml:space="preserve"/>
-      </w:r>
-    </w:p>
-    <w:p>
-      <w:pPr>
-        <w:rPr/>
-      </w:pPr>
-      <w:r>
-        <w:rPr>
-          <w:rtl w:val="0"/>
-        </w:rPr>
-        <w:t xml:space="preserve">до {{end}},</w:t>
-        <w:br w:type="textWrapping"/>
-        <w:t xml:space="preserve"/>
-      </w:r>
-    </w:p>
-    <w:p>
-      <w:pPr>
-        <w:rPr>
-          <w:b w:val="1"/>
-          <w:bCs w:val="1"/>
-        </w:rPr>
-      </w:pPr>
-      <w:r>
-        <w:rPr>
-          <w:rtl w:val="0"/>
-        </w:rPr>
-      </w:r>
-    </w:p>
-    <w:p>
-      <w:pPr>
+        <w:t xml:space="preserve">{{endTime}},</w:t>
+      </w:r>
+    </w:p>
+    <w:p>
+      <w:pPr>
+        <w:rPr>
+          <w:b w:val="1"/>
+          <w:bCs w:val="1"/>
+        </w:rPr>
+      </w:pPr>
+      <w:r>
+        <w:rPr>
+          <w:rtl w:val="0"/>
+        </w:rPr>
+      </w:r>
+    </w:p>
+    <w:p>
+      <w:pPr>
+        <w:keepNext/>
         <w:rPr>
           <w:b w:val="1"/>
           <w:bCs w:val="1"/>
@@ -638,8 +561,6 @@
           <w:rtl w:val="0"/>
         </w:rPr>
         <w:t xml:space="preserve">Наемната цена е {{rent}},</w:t>
-        <w:br w:type="textWrapping"/>
-        <w:t xml:space="preserve"/>
       </w:r>
     </w:p>
     <w:p>
@@ -665,6 +586,7 @@
     </w:p>
     <w:p>
       <w:pPr>
+        <w:keepNext/>
         <w:rPr>
           <w:b w:val="1"/>
           <w:bCs w:val="1"/>
@@ -751,7 +673,7 @@
       </w:pPr>
       <w:r>
         <w:rPr>
-          <w:rFonts w:ascii="Arial Unicode MS" w:cs="Arial Unicode MS" w:eastAsia="Arial Unicode MS" w:hAnsi="Arial Unicode MS"/>
+          <w:rFonts w:ascii="Arimo" w:cs="Arimo" w:eastAsia="Arimo" w:hAnsi="Arimo"/>
           <w:rtl w:val="0"/>
         </w:rPr>
         <w:t xml:space="preserve">{{delNo}}</w:t>
@@ -765,7 +687,7 @@
       </w:r>
       <w:r>
         <w:rPr>
-          <w:rFonts w:ascii="Arial Unicode MS" w:cs="Arial Unicode MS" w:eastAsia="Arial Unicode MS" w:hAnsi="Arial Unicode MS"/>
+          <w:rFonts w:ascii="Arimo" w:cs="Arimo" w:eastAsia="Arimo" w:hAnsi="Arimo"/>
           <w:rtl w:val="0"/>
         </w:rPr>
         <w:t xml:space="preserve">{{delYes}}</w:t>
@@ -794,7 +716,7 @@
       </w:pPr>
       <w:r>
         <w:rPr>
-          <w:rFonts w:ascii="Arial Unicode MS" w:cs="Arial Unicode MS" w:eastAsia="Arial Unicode MS" w:hAnsi="Arial Unicode MS"/>
+          <w:rFonts w:ascii="Arimo" w:cs="Arimo" w:eastAsia="Arimo" w:hAnsi="Arimo"/>
           <w:rtl w:val="0"/>
         </w:rPr>
         <w:t xml:space="preserve">{{retNo}}</w:t>
@@ -808,7 +730,7 @@
       </w:r>
       <w:r>
         <w:rPr>
-          <w:rFonts w:ascii="Arial Unicode MS" w:cs="Arial Unicode MS" w:eastAsia="Arial Unicode MS" w:hAnsi="Arial Unicode MS"/>
+          <w:rFonts w:ascii="Arimo" w:cs="Arimo" w:eastAsia="Arimo" w:hAnsi="Arimo"/>
           <w:rtl w:val="0"/>
         </w:rPr>
         <w:t xml:space="preserve">{{retYes}}</w:t>
@@ -837,7 +759,7 @@
       </w:pPr>
       <w:r>
         <w:rPr>
-          <w:rFonts w:ascii="Arial Unicode MS" w:cs="Arial Unicode MS" w:eastAsia="Arial Unicode MS" w:hAnsi="Arial Unicode MS"/>
+          <w:rFonts w:ascii="Arimo" w:cs="Arimo" w:eastAsia="Arimo" w:hAnsi="Arimo"/>
           <w:rtl w:val="0"/>
         </w:rPr>
         <w:t xml:space="preserve">{{abrNo}}</w:t>
@@ -851,7 +773,7 @@
       </w:r>
       <w:r>
         <w:rPr>
-          <w:rFonts w:ascii="Arial Unicode MS" w:cs="Arial Unicode MS" w:eastAsia="Arial Unicode MS" w:hAnsi="Arial Unicode MS"/>
+          <w:rFonts w:ascii="Arimo" w:cs="Arimo" w:eastAsia="Arimo" w:hAnsi="Arimo"/>
           <w:rtl w:val="0"/>
         </w:rPr>
         <w:t xml:space="preserve">{{abrYes}}</w:t>
@@ -871,10 +793,54 @@
         <w:rPr>
           <w:rtl w:val="0"/>
         </w:rPr>
-      </w:r>
-    </w:p>
-    <w:p>
-      <w:pPr>
+        <w:t xml:space="preserve">   7. Наемателя желае детско столче {{seatN}} и заплаща {{seatFee}} на ден за него/тях{{seatTotal}}</w:t>
+      </w:r>
+    </w:p>
+    <w:p>
+      <w:pPr>
+        <w:rPr/>
+      </w:pPr>
+      <w:r>
+        <w:rPr>
+          <w:rFonts w:ascii="Arimo" w:cs="Arimo" w:eastAsia="Arimo" w:hAnsi="Arimo"/>
+          <w:rtl w:val="0"/>
+        </w:rPr>
+        <w:t xml:space="preserve">{{seatNo}}</w:t>
+      </w:r>
+      <w:r>
+        <w:rPr>
+          <w:rtl w:val="0"/>
+        </w:rPr>
+        <w:t xml:space="preserve"> Няма столче/столчета</w:t>
+        <w:br w:type="textWrapping"/>
+      </w:r>
+      <w:r>
+        <w:rPr>
+          <w:rFonts w:ascii="Arimo" w:cs="Arimo" w:eastAsia="Arimo" w:hAnsi="Arimo"/>
+          <w:rtl w:val="0"/>
+        </w:rPr>
+        <w:t xml:space="preserve">{{seatYes}}</w:t>
+      </w:r>
+      <w:r>
+        <w:rPr>
+          <w:rtl w:val="0"/>
+        </w:rPr>
+        <w:t xml:space="preserve"> Има столче/столчета</w:t>
+      </w:r>
+    </w:p>
+    <w:p>
+      <w:pPr>
+        <w:rPr/>
+      </w:pPr>
+      <w:r>
+        <w:rPr>
+          <w:rtl w:val="0"/>
+        </w:rPr>
+      </w:r>
+    </w:p>
+    <w:p>
+      <w:pPr>
+        <w:keepNext/>
         <w:rPr>
           <w:b w:val="1"/>
           <w:bCs w:val="1"/>
@@ -966,6 +932,7 @@
     </w:p>
     <w:p>
       <w:pPr>
+        <w:keepNext/>
         <w:rPr>
           <w:b w:val="1"/>
           <w:bCs w:val="1"/>
@@ -982,6 +949,7 @@
     </w:p>
     <w:p>
       <w:pPr>
+        <w:keepNext/>
         <w:rPr>
           <w:b w:val="1"/>
           <w:bCs w:val="1"/>
@@ -1045,6 +1013,7 @@
     </w:p>
     <w:p>
       <w:pPr>
+        <w:keepNext/>
         <w:rPr>
           <w:b w:val="1"/>
           <w:bCs w:val="1"/>
@@ -1133,21 +1102,7 @@
         <w:rPr>
           <w:rtl w:val="0"/>
         </w:rPr>
-        <w:t xml:space="preserve">7. Връща автомобила в същото състояние – чист, технически изправен и с пълен резервоар, на адрес: </w:t>
-      </w:r>
-      <w:r>
-        <w:rPr>
-          <w:b w:val="1"/>
-          <w:bCs w:val="1"/>
-          <w:rtl w:val="0"/>
-        </w:rPr>
-        <w:t xml:space="preserve">{{returnPlace}} </w:t>
-      </w:r>
-      <w:r>
-        <w:rPr>
-          <w:rtl w:val="0"/>
-        </w:rPr>
-        <w:t xml:space="preserve">      </w:t>
+        <w:t xml:space="preserve">7. Връща автомобила в същото състояние – чист, технически изправен и с пълен резервоар, на адрес: {{returnPlace}}</w:t>
       </w:r>
     </w:p>
     <w:p>
@@ -1198,6 +1153,7 @@
     </w:p>
     <w:p>
       <w:pPr>
+        <w:keepNext/>
         <w:rPr/>
       </w:pPr>
       <w:r>
@@ -1216,6 +1172,7 @@
     </w:p>
     <w:p>
       <w:pPr>
+        <w:keepNext/>
         <w:rPr/>
       </w:pPr>
       <w:r>
@@ -1296,6 +1253,7 @@
     </w:p>
     <w:p>
       <w:pPr>
+        <w:keepNext/>
         <w:rPr>
           <w:b w:val="1"/>
           <w:bCs w:val="1"/>
@@ -1312,6 +1270,7 @@
     </w:p>
     <w:p>
       <w:pPr>
+        <w:keepNext/>
         <w:rPr>
           <w:b w:val="1"/>
           <w:bCs w:val="1"/>
@@ -1418,6 +1377,7 @@
     </w:p>
     <w:p>
       <w:pPr>
+        <w:keepNext/>
         <w:rPr/>
       </w:pPr>
       <w:r>
@@ -1641,7 +1601,7 @@
         <w:rPr>
           <w:rtl w:val="0"/>
         </w:rPr>
-        <w:t xml:space="preserve">при напускане пределите на Република България – неустойка 200,00 EUR.</w:t>
+        <w:t xml:space="preserve">при напускане пределите на Република България без заплатената едократна такса– неустойка 200,00 EUR.</w:t>
       </w:r>
     </w:p>
     <w:p>
@@ -1658,6 +1618,7 @@
     </w:p>
     <w:p>
       <w:pPr>
+        <w:keepNext/>
         <w:rPr>
           <w:b w:val="1"/>
           <w:bCs w:val="1"/>
@@ -1674,6 +1635,7 @@
     </w:p>
     <w:p>
       <w:pPr>
+        <w:keepNext/>
         <w:rPr>
           <w:b w:val="1"/>
           <w:bCs w:val="1"/>
@@ -1745,6 +1707,11 @@
         </w:rPr>
         <w:t xml:space="preserve">разходи за ремонт; </w:t>
       </w:r>
+      <w:r>
+        <w:rPr>
+          <w:rtl w:val="0"/>
+        </w:rPr>
+      </w:r>
     </w:p>
     <w:p>
       <w:pPr>
@@ -1765,6 +1732,11 @@
         </w:rPr>
         <w:t xml:space="preserve">транспорт на автомобила; </w:t>
       </w:r>
+      <w:r>
+        <w:rPr>
+          <w:rtl w:val="0"/>
+        </w:rPr>
+      </w:r>
     </w:p>
     <w:p>
       <w:pPr>
@@ -1785,6 +1757,11 @@
         </w:rPr>
         <w:t xml:space="preserve">експертизи; </w:t>
       </w:r>
+      <w:r>
+        <w:rPr>
+          <w:rtl w:val="0"/>
+        </w:rPr>
+      </w:r>
     </w:p>
     <w:p>
       <w:pPr>
@@ -1805,6 +1782,11 @@
         </w:rPr>
         <w:t xml:space="preserve">документално доказани административни разходи; </w:t>
       </w:r>
+      <w:r>
+        <w:rPr>
+          <w:rtl w:val="0"/>
+        </w:rPr>
+      </w:r>
     </w:p>
     <w:p>
       <w:pPr>
@@ -1825,6 +1807,11 @@
         </w:rPr>
         <w:t xml:space="preserve">разходи за възстановяване на липсващи части, оборудване, ключове или документи; </w:t>
       </w:r>
+      <w:r>
+        <w:rPr>
+          <w:rtl w:val="0"/>
+        </w:rPr>
+      </w:r>
     </w:p>
     <w:p>
       <w:pPr>
@@ -1845,6 +1832,11 @@
         </w:rPr>
         <w:t xml:space="preserve">доказано намаляване на стойността на автомобила, когато е пряка последица от увреждането. </w:t>
       </w:r>
+      <w:r>
+        <w:rPr>
+          <w:rtl w:val="0"/>
+        </w:rPr>
+      </w:r>
     </w:p>
     <w:p>
       <w:pPr>
@@ -1896,6 +1888,7 @@
     </w:p>
     <w:p>
       <w:pPr>
+        <w:keepNext/>
         <w:rPr>
           <w:b w:val="1"/>
           <w:bCs w:val="1"/>
@@ -1912,6 +1905,7 @@
     </w:p>
     <w:p>
       <w:pPr>
+        <w:keepNext/>
         <w:rPr>
           <w:b w:val="1"/>
           <w:bCs w:val="1"/>
@@ -1956,6 +1950,7 @@
     </w:p>
     <w:p>
       <w:pPr>
+        <w:keepNext/>
         <w:rPr>
           <w:b w:val="1"/>
           <w:bCs w:val="1"/>
@@ -1972,6 +1967,7 @@
     </w:p>
     <w:p>
       <w:pPr>
+        <w:keepNext/>
         <w:rPr>
           <w:b w:val="1"/>
           <w:bCs w:val="1"/>
@@ -2052,6 +2048,7 @@
     </w:p>
     <w:p>
       <w:pPr>
+        <w:keepNext/>
         <w:rPr>
           <w:b w:val="1"/>
           <w:bCs w:val="1"/>
@@ -2068,6 +2065,7 @@
     </w:p>
     <w:p>
       <w:pPr>
+        <w:keepNext/>
         <w:rPr>
           <w:b w:val="1"/>
           <w:bCs w:val="1"/>
@@ -2119,6 +2117,7 @@
     </w:p>
     <w:p>
       <w:pPr>
+        <w:keepNext/>
         <w:rPr>
           <w:b w:val="1"/>
           <w:bCs w:val="1"/>
@@ -2135,6 +2134,7 @@
     </w:p>
     <w:p>
       <w:pPr>
+        <w:keepNext/>
         <w:rPr>
           <w:b w:val="1"/>
           <w:bCs w:val="1"/>
@@ -2175,6 +2175,7 @@
     </w:p>
     <w:p>
       <w:pPr>
+        <w:keepNext/>
         <w:rPr>
           <w:b w:val="1"/>
           <w:bCs w:val="1"/>
@@ -2197,6 +2198,7 @@
     </w:p>
     <w:p>
       <w:pPr>
+        <w:keepNext/>
         <w:rPr>
           <w:b w:val="1"/>
           <w:bCs w:val="1"/>
@@ -2248,6 +2250,7 @@
     </w:p>
     <w:p>
       <w:pPr>
+        <w:keepNext/>
         <w:rPr>
           <w:b w:val="1"/>
           <w:bCs w:val="1"/>
@@ -2264,6 +2267,7 @@
     </w:p>
     <w:p>
       <w:pPr>
+        <w:keepNext/>
         <w:rPr>
           <w:b w:val="1"/>
           <w:bCs w:val="1"/>
@@ -2342,6 +2346,7 @@
     </w:p>
     <w:p>
       <w:pPr>
+        <w:keepNext/>
         <w:ind w:left="0" w:firstLine="0"/>
         <w:rPr>
           <w:b w:val="1"/>
@@ -2359,6 +2364,7 @@
     </w:p>
     <w:p>
       <w:pPr>
+        <w:keepNext/>
         <w:rPr/>
       </w:pPr>
       <w:r>
@@ -2500,6 +2506,7 @@
           </w:p>
           <w:p>
             <w:pPr>
+              <w:keepNext/>
               <w:rPr>
                 <w:b w:val="1"/>
                 <w:bCs w:val="1"/>
@@ -2516,6 +2523,7 @@
           </w:p>
           <w:p>
             <w:pPr>
+              <w:keepNext/>
               <w:rPr>
                 <w:b w:val="1"/>
                 <w:bCs w:val="1"/>
@@ -2569,6 +2577,7 @@
           </w:p>
           <w:p>
             <w:pPr>
+              <w:keepNext/>
               <w:rPr>
                 <w:b w:val="1"/>
                 <w:bCs w:val="1"/>
@@ -2745,6 +2754,7 @@
     </w:p>
     <w:p>
       <w:pPr>
+        <w:pageBreakBefore/>
         <w:spacing w:after="280" w:before="280" w:line="240" w:lineRule="auto"/>
         <w:rPr>
           <w:rFonts w:ascii="Times New Roman" w:cs="Times New Roman" w:eastAsia="Times New Roman" w:hAnsi="Times New Roman"/>
@@ -2780,6 +2790,7 @@
     </w:p>
     <w:p>
       <w:pPr>
+        <w:keepNext/>
         <w:rPr>
           <w:b w:val="1"/>
           <w:bCs w:val="1"/>
@@ -2809,6 +2820,7 @@
     </w:p>
     <w:p>
       <w:pPr>
+        <w:keepNext/>
         <w:rPr>
           <w:b w:val="1"/>
           <w:bCs w:val="1"/>
@@ -2831,11 +2843,11 @@
         <w:rPr>
           <w:rtl w:val="0"/>
         </w:rPr>
-        <w:t xml:space="preserve">Дата: {{d1}} г. Час: {{t1}} ч. Адрес: {{pickupPlace}}</w:t>
+        <w:t xml:space="preserve">Дата: {{d1}} г.</w:t>
         <w:br w:type="textWrapping"/>
-        <w:t xml:space="preserve"/>
+        <w:t xml:space="preserve">Час: {{t1}} ч.</w:t>
         <w:br w:type="textWrapping"/>
-        <w:t xml:space="preserve"/>
+        <w:t xml:space="preserve">Адрес: {{pickupPlace}}</w:t>
       </w:r>
     </w:p>
     <w:p>
@@ -2866,13 +2878,7 @@
           <w:bCs w:val="1"/>
           <w:rtl w:val="0"/>
         </w:rPr>
-        <w:t xml:space="preserve">Марка / Модел:  </w:t>
-      </w:r>
-      <w:r>
-        <w:rPr>
-          <w:rtl w:val="0"/>
-        </w:rPr>
-        <w:t xml:space="preserve">{{carModel}} </w:t>
+        <w:t xml:space="preserve">Марка / Модел: {{carModel}}</w:t>
       </w:r>
     </w:p>
     <w:p>
@@ -2893,18 +2899,7 @@
           <w:bCs w:val="1"/>
           <w:rtl w:val="0"/>
         </w:rPr>
-        <w:t xml:space="preserve">Регистрационен номер: </w:t>
-      </w:r>
-      <w:r>
-        <w:rPr>
-          <w:rtl w:val="0"/>
-        </w:rPr>
-        <w:t xml:space="preserve">{{carReg}} </w:t>
-      </w:r>
-      <w:r>
-        <w:rPr>
-          <w:rtl w:val="0"/>
-        </w:rPr>
+        <w:t xml:space="preserve">Регистрационен номер: {{carReg}}</w:t>
       </w:r>
     </w:p>
     <w:p>
@@ -2925,18 +2920,7 @@
           <w:bCs w:val="1"/>
           <w:rtl w:val="0"/>
         </w:rPr>
-        <w:t xml:space="preserve">VIN: </w:t>
-      </w:r>
-      <w:r>
-        <w:rPr>
-          <w:rtl w:val="0"/>
-        </w:rPr>
-        <w:t xml:space="preserve">{{carVin}} </w:t>
-      </w:r>
-      <w:r>
-        <w:rPr>
-          <w:rtl w:val="0"/>
-        </w:rPr>
+        <w:t xml:space="preserve">VIN: {{carVin}}</w:t>
       </w:r>
     </w:p>
     <w:p>
@@ -2957,18 +2941,7 @@
           <w:bCs w:val="1"/>
           <w:rtl w:val="0"/>
         </w:rPr>
-        <w:t xml:space="preserve">Гориво: </w:t>
-      </w:r>
-      <w:r>
-        <w:rPr>
-          <w:rtl w:val="0"/>
-        </w:rPr>
-        <w:t xml:space="preserve">{{carFuel}} </w:t>
-      </w:r>
-      <w:r>
-        <w:rPr>
-          <w:rtl w:val="0"/>
-        </w:rPr>
+        <w:t xml:space="preserve">Гориво: {{carFuel}}</w:t>
       </w:r>
     </w:p>
     <w:p>
@@ -2989,30 +2962,25 @@
           <w:bCs w:val="1"/>
           <w:rtl w:val="0"/>
         </w:rPr>
-        <w:t xml:space="preserve">Цвят: </w:t>
-      </w:r>
-      <w:r>
-        <w:rPr>
-          <w:rtl w:val="0"/>
-        </w:rPr>
-        <w:t xml:space="preserve">{{carColor}} </w:t>
-      </w:r>
-    </w:p>
-    <w:p>
-      <w:pPr>
-        <w:rPr>
-          <w:b w:val="1"/>
-          <w:bCs w:val="1"/>
-        </w:rPr>
-      </w:pPr>
-      <w:r>
-        <w:rPr>
-          <w:rtl w:val="0"/>
-        </w:rPr>
-      </w:r>
-    </w:p>
-    <w:p>
-      <w:pPr>
+        <w:t xml:space="preserve">Цвят: {{carColor}}</w:t>
+      </w:r>
+    </w:p>
+    <w:p>
+      <w:pPr>
+        <w:rPr>
+          <w:b w:val="1"/>
+          <w:bCs w:val="1"/>
+        </w:rPr>
+      </w:pPr>
+      <w:r>
+        <w:rPr>
+          <w:rtl w:val="0"/>
+        </w:rPr>
+      </w:r>
+    </w:p>
+    <w:p>
+      <w:pPr>
+        <w:keepNext/>
         <w:rPr>
           <w:b w:val="1"/>
           <w:bCs w:val="1"/>
@@ -3040,7 +3008,7 @@
       </w:r>
       <w:r>
         <w:rPr>
-          <w:rFonts w:ascii="Arial Unicode MS" w:cs="Arial Unicode MS" w:eastAsia="Arial Unicode MS" w:hAnsi="Arial Unicode MS"/>
+          <w:rFonts w:ascii="Arimo" w:cs="Arimo" w:eastAsia="Arimo" w:hAnsi="Arimo"/>
           <w:rtl w:val="0"/>
         </w:rPr>
         <w:t xml:space="preserve">☒</w:t>
@@ -3066,7 +3034,7 @@
       </w:r>
       <w:r>
         <w:rPr>
-          <w:rFonts w:ascii="Arial Unicode MS" w:cs="Arial Unicode MS" w:eastAsia="Arial Unicode MS" w:hAnsi="Arial Unicode MS"/>
+          <w:rFonts w:ascii="Arimo" w:cs="Arimo" w:eastAsia="Arimo" w:hAnsi="Arimo"/>
           <w:rtl w:val="0"/>
         </w:rPr>
         <w:t xml:space="preserve">☐</w:t>
@@ -3125,6 +3093,7 @@
     </w:p>
     <w:p>
       <w:pPr>
+        <w:keepNext/>
         <w:rPr>
           <w:b w:val="1"/>
           <w:bCs w:val="1"/>
@@ -3157,6 +3126,7 @@
     </w:p>
     <w:p>
       <w:pPr>
+        <w:keepNext/>
         <w:rPr>
           <w:b w:val="1"/>
           <w:bCs w:val="1"/>
@@ -3184,6 +3154,7 @@
     </w:p>
     <w:p>
       <w:pPr>
+        <w:keepNext/>
         <w:rPr>
           <w:b w:val="1"/>
           <w:bCs w:val="1"/>
@@ -3204,7 +3175,7 @@
       </w:pPr>
       <w:r>
         <w:rPr>
-          <w:rFonts w:ascii="Arial Unicode MS" w:cs="Arial Unicode MS" w:eastAsia="Arial Unicode MS" w:hAnsi="Arial Unicode MS"/>
+          <w:rFonts w:ascii="Arimo" w:cs="Arimo" w:eastAsia="Arimo" w:hAnsi="Arimo"/>
           <w:rtl w:val="0"/>
         </w:rPr>
         <w:t xml:space="preserve">☒</w:t>
@@ -3218,7 +3189,7 @@
       </w:r>
       <w:r>
         <w:rPr>
-          <w:rFonts w:ascii="Arial Unicode MS" w:cs="Arial Unicode MS" w:eastAsia="Arial Unicode MS" w:hAnsi="Arial Unicode MS"/>
+          <w:rFonts w:ascii="Arimo" w:cs="Arimo" w:eastAsia="Arimo" w:hAnsi="Arimo"/>
           <w:rtl w:val="0"/>
         </w:rPr>
         <w:t xml:space="preserve">☒</w:t>
@@ -3257,7 +3228,7 @@
       </w:r>
       <w:r>
         <w:rPr>
-          <w:rFonts w:ascii="Arial Unicode MS" w:cs="Arial Unicode MS" w:eastAsia="Arial Unicode MS" w:hAnsi="Arial Unicode MS"/>
+          <w:rFonts w:ascii="Arimo" w:cs="Arimo" w:eastAsia="Arimo" w:hAnsi="Arimo"/>
           <w:rtl w:val="0"/>
         </w:rPr>
         <w:t xml:space="preserve">☒</w:t>
@@ -3293,6 +3264,7 @@
     </w:p>
     <w:p>
       <w:pPr>
+        <w:keepNext/>
         <w:rPr>
           <w:b w:val="1"/>
           <w:bCs w:val="1"/>
@@ -3313,7 +3285,7 @@
       </w:pPr>
       <w:r>
         <w:rPr>
-          <w:rFonts w:ascii="Arial Unicode MS" w:cs="Arial Unicode MS" w:eastAsia="Arial Unicode MS" w:hAnsi="Arial Unicode MS"/>
+          <w:rFonts w:ascii="Arimo" w:cs="Arimo" w:eastAsia="Arimo" w:hAnsi="Arimo"/>
           <w:rtl w:val="0"/>
         </w:rPr>
         <w:t xml:space="preserve">☒</w:t>
@@ -3327,7 +3299,7 @@
       </w:r>
       <w:r>
         <w:rPr>
-          <w:rFonts w:ascii="Arial Unicode MS" w:cs="Arial Unicode MS" w:eastAsia="Arial Unicode MS" w:hAnsi="Arial Unicode MS"/>
+          <w:rFonts w:ascii="Arimo" w:cs="Arimo" w:eastAsia="Arimo" w:hAnsi="Arimo"/>
           <w:rtl w:val="0"/>
         </w:rPr>
         <w:t xml:space="preserve">☒</w:t>
@@ -3354,7 +3326,7 @@
       </w:r>
       <w:r>
         <w:rPr>
-          <w:rFonts w:ascii="Arial Unicode MS" w:cs="Arial Unicode MS" w:eastAsia="Arial Unicode MS" w:hAnsi="Arial Unicode MS"/>
+          <w:rFonts w:ascii="Arimo" w:cs="Arimo" w:eastAsia="Arimo" w:hAnsi="Arimo"/>
           <w:rtl w:val="0"/>
         </w:rPr>
         <w:t xml:space="preserve">☒</w:t>
@@ -3380,7 +3352,7 @@
       </w:r>
       <w:r>
         <w:rPr>
-          <w:rFonts w:ascii="Arial Unicode MS" w:cs="Arial Unicode MS" w:eastAsia="Arial Unicode MS" w:hAnsi="Arial Unicode MS"/>
+          <w:rFonts w:ascii="Arimo" w:cs="Arimo" w:eastAsia="Arimo" w:hAnsi="Arimo"/>
           <w:rtl w:val="0"/>
         </w:rPr>
         <w:t xml:space="preserve">☒</w:t>
@@ -3419,7 +3391,7 @@
       </w:r>
       <w:r>
         <w:rPr>
-          <w:rFonts w:ascii="Arial Unicode MS" w:cs="Arial Unicode MS" w:eastAsia="Arial Unicode MS" w:hAnsi="Arial Unicode MS"/>
+          <w:rFonts w:ascii="Arimo" w:cs="Arimo" w:eastAsia="Arimo" w:hAnsi="Arimo"/>
           <w:rtl w:val="0"/>
         </w:rPr>
         <w:t xml:space="preserve">☒</w:t>
@@ -3458,7 +3430,7 @@
       </w:r>
       <w:r>
         <w:rPr>
-          <w:rFonts w:ascii="Arial Unicode MS" w:cs="Arial Unicode MS" w:eastAsia="Arial Unicode MS" w:hAnsi="Arial Unicode MS"/>
+          <w:rFonts w:ascii="Arimo" w:cs="Arimo" w:eastAsia="Arimo" w:hAnsi="Arimo"/>
           <w:rtl w:val="0"/>
         </w:rPr>
         <w:t xml:space="preserve">☒</w:t>
@@ -3484,7 +3456,7 @@
       </w:r>
       <w:r>
         <w:rPr>
-          <w:rFonts w:ascii="Arial Unicode MS" w:cs="Arial Unicode MS" w:eastAsia="Arial Unicode MS" w:hAnsi="Arial Unicode MS"/>
+          <w:rFonts w:ascii="Arimo" w:cs="Arimo" w:eastAsia="Arimo" w:hAnsi="Arimo"/>
           <w:rtl w:val="0"/>
         </w:rPr>
         <w:t xml:space="preserve">☒</w:t>
@@ -3546,6 +3518,7 @@
     </w:p>
     <w:p>
       <w:pPr>
+        <w:keepNext/>
         <w:rPr>
           <w:b w:val="1"/>
           <w:bCs w:val="1"/>
@@ -3566,7 +3539,7 @@
       </w:pPr>
       <w:r>
         <w:rPr>
-          <w:rFonts w:ascii="Arial Unicode MS" w:cs="Arial Unicode MS" w:eastAsia="Arial Unicode MS" w:hAnsi="Arial Unicode MS"/>
+          <w:rFonts w:ascii="Arimo" w:cs="Arimo" w:eastAsia="Arimo" w:hAnsi="Arimo"/>
           <w:rtl w:val="0"/>
         </w:rPr>
         <w:t xml:space="preserve">☒</w:t>
@@ -3580,7 +3553,7 @@
       </w:r>
       <w:r>
         <w:rPr>
-          <w:rFonts w:ascii="Arial Unicode MS" w:cs="Arial Unicode MS" w:eastAsia="Arial Unicode MS" w:hAnsi="Arial Unicode MS"/>
+          <w:rFonts w:ascii="Arimo" w:cs="Arimo" w:eastAsia="Arimo" w:hAnsi="Arimo"/>
           <w:rtl w:val="0"/>
         </w:rPr>
         <w:t xml:space="preserve">☒</w:t>
@@ -3647,6 +3620,7 @@
           </w:p>
           <w:p>
             <w:pPr>
+              <w:keepNext/>
               <w:rPr>
                 <w:b w:val="1"/>
                 <w:bCs w:val="1"/>
@@ -3663,6 +3637,7 @@
           </w:p>
           <w:p>
             <w:pPr>
+              <w:keepNext/>
               <w:rPr>
                 <w:b w:val="1"/>
                 <w:bCs w:val="1"/>
@@ -3716,6 +3691,7 @@
           </w:p>
           <w:p>
             <w:pPr>
+              <w:keepNext/>
               <w:rPr>
                 <w:b w:val="1"/>
                 <w:bCs w:val="1"/>
@@ -3883,6 +3859,8 @@
     </w:p>
     <w:p>
       <w:pPr>
+        <w:keepNext/>
+        <w:pageBreakBefore/>
         <w:rPr>
           <w:b w:val="1"/>
           <w:bCs w:val="1"/>
@@ -3899,6 +3877,7 @@
     </w:p>
     <w:p>
       <w:pPr>
+        <w:keepNext/>
         <w:rPr>
           <w:b w:val="1"/>
           <w:bCs w:val="1"/>
@@ -3921,25 +3900,26 @@
         <w:rPr>
           <w:rtl w:val="0"/>
         </w:rPr>
-        <w:t xml:space="preserve">Дата: {{d2}} г. Час: {{t2}} ч. Адрес: {{returnPlace}}</w:t>
+        <w:t xml:space="preserve">Дата: {{d2}} г.</w:t>
         <w:br w:type="textWrapping"/>
-        <w:t xml:space="preserve"/>
+        <w:t xml:space="preserve">Час: {{t2}} ч.</w:t>
         <w:br w:type="textWrapping"/>
-        <w:t xml:space="preserve"/>
-      </w:r>
-    </w:p>
-    <w:p>
-      <w:pPr>
-        <w:rPr/>
-      </w:pPr>
-      <w:r>
-        <w:rPr>
-          <w:rtl w:val="0"/>
-        </w:rPr>
-      </w:r>
-    </w:p>
-    <w:p>
-      <w:pPr>
+        <w:t xml:space="preserve">Адрес: {{returnPlace}}</w:t>
+      </w:r>
+    </w:p>
+    <w:p>
+      <w:pPr>
+        <w:rPr/>
+      </w:pPr>
+      <w:r>
+        <w:rPr>
+          <w:rtl w:val="0"/>
+        </w:rPr>
+      </w:r>
+    </w:p>
+    <w:p>
+      <w:pPr>
+        <w:keepNext/>
         <w:rPr>
           <w:b w:val="1"/>
           <w:bCs w:val="1"/>
@@ -3977,6 +3957,7 @@
     </w:p>
     <w:p>
       <w:pPr>
+        <w:keepNext/>
         <w:rPr>
           <w:b w:val="1"/>
           <w:bCs w:val="1"/>
@@ -4017,6 +3998,7 @@
     </w:p>
     <w:p>
       <w:pPr>
+        <w:keepNext/>
         <w:rPr>
           <w:b w:val="1"/>
           <w:bCs w:val="1"/>
@@ -4044,7 +4026,7 @@
       </w:r>
       <w:r>
         <w:rPr>
-          <w:rFonts w:ascii="Arial Unicode MS" w:cs="Arial Unicode MS" w:eastAsia="Arial Unicode MS" w:hAnsi="Arial Unicode MS"/>
+          <w:rFonts w:ascii="Arimo" w:cs="Arimo" w:eastAsia="Arimo" w:hAnsi="Arimo"/>
           <w:rtl w:val="0"/>
         </w:rPr>
         <w:t xml:space="preserve">☐</w:t>
@@ -4058,7 +4040,7 @@
       </w:r>
       <w:r>
         <w:rPr>
-          <w:rFonts w:ascii="Arial Unicode MS" w:cs="Arial Unicode MS" w:eastAsia="Arial Unicode MS" w:hAnsi="Arial Unicode MS"/>
+          <w:rFonts w:ascii="Arimo" w:cs="Arimo" w:eastAsia="Arimo" w:hAnsi="Arimo"/>
           <w:rtl w:val="0"/>
         </w:rPr>
         <w:t xml:space="preserve">☐</w:t>
@@ -4204,6 +4186,7 @@
           </w:p>
           <w:p>
             <w:pPr>
+              <w:keepNext/>
               <w:rPr>
                 <w:b w:val="1"/>
                 <w:bCs w:val="1"/>
@@ -4220,6 +4203,7 @@
           </w:p>
           <w:p>
             <w:pPr>
+              <w:keepNext/>
               <w:rPr>
                 <w:b w:val="1"/>
                 <w:bCs w:val="1"/>
@@ -4273,6 +4257,7 @@
           </w:p>
           <w:p>
             <w:pPr>
+              <w:keepNext/>
               <w:rPr>
                 <w:b w:val="1"/>
                 <w:bCs w:val="1"/>
@@ -4462,6 +4447,7 @@
     </w:p>
     <w:p>
       <w:pPr>
+        <w:pageBreakBefore/>
         <w:rPr>
           <w:b w:val="1"/>
           <w:bCs w:val="1"/>
@@ -4509,7 +4495,7 @@
         <w:rPr>
           <w:rtl w:val="0"/>
         </w:rPr>
-        <w:t xml:space="preserve">в качеството си на НАЕМАТЕЛ по Договор за наем на моторно превозно средство                                         от дата {{date}} г.,</w:t>
+        <w:t xml:space="preserve">в качеството си на НАЕМАТЕЛ по Договор за наем на моторно превозно средство                                      от дата {{date}} г.,</w:t>
       </w:r>
     </w:p>
     <w:p>
@@ -4635,12 +4621,6 @@
         </w:rPr>
         <w:t xml:space="preserve">Дата: {{date}} г.</w:t>
       </w:r>
-      <w:r>
-        <w:rPr>
-          <w:rtl w:val="0"/>
-        </w:rPr>
-        <w:t xml:space="preserve"/>
-      </w:r>
     </w:p>
     <w:p>
       <w:pPr>
@@ -4728,6 +4708,7 @@
     </w:p>
     <w:p>
       <w:pPr>
+        <w:pageBreakBefore/>
         <w:rPr/>
       </w:pPr>
       <w:r>
@@ -4871,7 +4852,7 @@
         <w:br w:type="textWrapping"/>
         <w:t xml:space="preserve">със седалище и адрес на управление: гр. Пловдив, бул. „Дунав“ №10 e-mail: </w:t>
       </w:r>
-      <w:hyperlink r:id="rId6">
+      <w:hyperlink r:id="rId7">
         <w:r>
           <w:rPr>
             <w:rFonts w:ascii="-webkit-standard" w:cs="-webkit-standard" w:eastAsia="-webkit-standard" w:hAnsi="-webkit-standard"/>
@@ -5711,7 +5692,7 @@
       <w:pPr>
         <w:rPr/>
       </w:pPr>
-      <w:bookmarkStart w:colFirst="0" w:colLast="0" w:name="_aryxznqfk8nz" w:id="0"/>
+      <w:bookmarkStart w:colFirst="0" w:colLast="0" w:name="_heading=h.y3v34yj8ehil" w:id="0"/>
       <w:bookmarkEnd w:id="0"/>
       <w:r>
         <w:rPr>
@@ -5721,7 +5702,7 @@
       </w:r>
     </w:p>
     <w:sectPr>
-      <w:footerReference r:id="rId7" w:type="default"/>
+      <w:footerReference r:id="rId8" w:type="default"/>
       <w:pgSz w:h="16838" w:w="11906" w:orient="portrait"/>
       <w:pgMar w:bottom="1417" w:top="1417" w:left="1417" w:right="1417" w:header="708" w:footer="708"/>
       <w:pgNumType w:start="1"/>
@@ -5736,7 +5717,6 @@
     <w:pPr>
       <w:keepNext w:val="0"/>
       <w:keepLines w:val="0"/>
-      <w:pageBreakBefore w:val="0"/>
       <w:widowControl w:val="1"/>
       <w:pBdr>
         <w:top w:space="0" w:sz="0" w:val="nil"/>
@@ -5785,9 +5765,204 @@
         <w:shd w:fill="auto" w:val="clear"/>
         <w:vertAlign w:val="baseline"/>
       </w:rPr>
+      <w:t xml:space="preserve">Страница </w:t>
+    </w:r>
+    <w:r>
+      <w:rPr>
+        <w:rFonts w:ascii="Calibri" w:cs="Calibri" w:eastAsia="Calibri" w:hAnsi="Calibri"/>
+        <w:b w:val="0"/>
+        <w:bCs w:val="0"/>
+        <w:i w:val="0"/>
+        <w:iCs w:val="0"/>
+        <w:smallCaps w:val="0"/>
+        <w:strike w:val="0"/>
+        <w:color w:val="000000"/>
+        <w:sz w:val="22"/>
+        <w:szCs w:val="22"/>
+        <w:u w:val="none"/>
+        <w:shd w:fill="auto" w:val="clear"/>
+        <w:vertAlign w:val="baseline"/>
+      </w:rPr>
       <w:fldChar w:fldCharType="begin"/>
-      <w:instrText xml:space="preserve">PAGE</w:instrText>
+    </w:r>
+    <w:r>
+      <w:rPr>
+        <w:rFonts w:ascii="Calibri" w:cs="Calibri" w:eastAsia="Calibri" w:hAnsi="Calibri"/>
+        <w:b w:val="0"/>
+        <w:bCs w:val="0"/>
+        <w:i w:val="0"/>
+        <w:iCs w:val="0"/>
+        <w:smallCaps w:val="0"/>
+        <w:strike w:val="0"/>
+        <w:color w:val="000000"/>
+        <w:sz w:val="22"/>
+        <w:szCs w:val="22"/>
+        <w:u w:val="none"/>
+        <w:shd w:fill="auto" w:val="clear"/>
+        <w:vertAlign w:val="baseline"/>
+      </w:rPr>
+      <w:instrText xml:space="preserve"> PAGE </w:instrText>
+    </w:r>
+    <w:r>
+      <w:rPr>
+        <w:rFonts w:ascii="Calibri" w:cs="Calibri" w:eastAsia="Calibri" w:hAnsi="Calibri"/>
+        <w:b w:val="0"/>
+        <w:bCs w:val="0"/>
+        <w:i w:val="0"/>
+        <w:iCs w:val="0"/>
+        <w:smallCaps w:val="0"/>
+        <w:strike w:val="0"/>
+        <w:color w:val="000000"/>
+        <w:sz w:val="22"/>
+        <w:szCs w:val="22"/>
+        <w:u w:val="none"/>
+        <w:shd w:fill="auto" w:val="clear"/>
+        <w:vertAlign w:val="baseline"/>
+      </w:rPr>
       <w:fldChar w:fldCharType="separate"/>
+    </w:r>
+    <w:r>
+      <w:rPr>
+        <w:rFonts w:ascii="Calibri" w:cs="Calibri" w:eastAsia="Calibri" w:hAnsi="Calibri"/>
+        <w:b w:val="0"/>
+        <w:bCs w:val="0"/>
+        <w:i w:val="0"/>
+        <w:iCs w:val="0"/>
+        <w:smallCaps w:val="0"/>
+        <w:strike w:val="0"/>
+        <w:color w:val="000000"/>
+        <w:sz w:val="22"/>
+        <w:szCs w:val="22"/>
+        <w:u w:val="none"/>
+        <w:shd w:fill="auto" w:val="clear"/>
+        <w:vertAlign w:val="baseline"/>
+      </w:rPr>
+      <w:t>1</w:t>
+    </w:r>
+    <w:r>
+      <w:rPr>
+        <w:rFonts w:ascii="Calibri" w:cs="Calibri" w:eastAsia="Calibri" w:hAnsi="Calibri"/>
+        <w:b w:val="0"/>
+        <w:bCs w:val="0"/>
+        <w:i w:val="0"/>
+        <w:iCs w:val="0"/>
+        <w:smallCaps w:val="0"/>
+        <w:strike w:val="0"/>
+        <w:color w:val="000000"/>
+        <w:sz w:val="22"/>
+        <w:szCs w:val="22"/>
+        <w:u w:val="none"/>
+        <w:shd w:fill="auto" w:val="clear"/>
+        <w:vertAlign w:val="baseline"/>
+      </w:rPr>
+      <w:fldChar w:fldCharType="end"/>
+    </w:r>
+    <w:r>
+      <w:rPr>
+        <w:rFonts w:ascii="Calibri" w:cs="Calibri" w:eastAsia="Calibri" w:hAnsi="Calibri"/>
+        <w:b w:val="0"/>
+        <w:bCs w:val="0"/>
+        <w:i w:val="0"/>
+        <w:iCs w:val="0"/>
+        <w:smallCaps w:val="0"/>
+        <w:strike w:val="0"/>
+        <w:color w:val="000000"/>
+        <w:sz w:val="22"/>
+        <w:szCs w:val="22"/>
+        <w:u w:val="none"/>
+        <w:shd w:fill="auto" w:val="clear"/>
+        <w:vertAlign w:val="baseline"/>
+      </w:rPr>
+      <w:t xml:space="preserve"> от </w:t>
+    </w:r>
+    <w:r>
+      <w:rPr>
+        <w:rFonts w:ascii="Calibri" w:cs="Calibri" w:eastAsia="Calibri" w:hAnsi="Calibri"/>
+        <w:b w:val="0"/>
+        <w:bCs w:val="0"/>
+        <w:i w:val="0"/>
+        <w:iCs w:val="0"/>
+        <w:smallCaps w:val="0"/>
+        <w:strike w:val="0"/>
+        <w:color w:val="000000"/>
+        <w:sz w:val="22"/>
+        <w:szCs w:val="22"/>
+        <w:u w:val="none"/>
+        <w:shd w:fill="auto" w:val="clear"/>
+        <w:vertAlign w:val="baseline"/>
+      </w:rPr>
+      <w:fldChar w:fldCharType="begin"/>
+    </w:r>
+    <w:r>
+      <w:rPr>
+        <w:rFonts w:ascii="Calibri" w:cs="Calibri" w:eastAsia="Calibri" w:hAnsi="Calibri"/>
+        <w:b w:val="0"/>
+        <w:bCs w:val="0"/>
+        <w:i w:val="0"/>
+        <w:iCs w:val="0"/>
+        <w:smallCaps w:val="0"/>
+        <w:strike w:val="0"/>
+        <w:color w:val="000000"/>
+        <w:sz w:val="22"/>
+        <w:szCs w:val="22"/>
+        <w:u w:val="none"/>
+        <w:shd w:fill="auto" w:val="clear"/>
+        <w:vertAlign w:val="baseline"/>
+      </w:rPr>
+      <w:instrText xml:space="preserve"> NUMPAGES </w:instrText>
+    </w:r>
+    <w:r>
+      <w:rPr>
+        <w:rFonts w:ascii="Calibri" w:cs="Calibri" w:eastAsia="Calibri" w:hAnsi="Calibri"/>
+        <w:b w:val="0"/>
+        <w:bCs w:val="0"/>
+        <w:i w:val="0"/>
+        <w:iCs w:val="0"/>
+        <w:smallCaps w:val="0"/>
+        <w:strike w:val="0"/>
+        <w:color w:val="000000"/>
+        <w:sz w:val="22"/>
+        <w:szCs w:val="22"/>
+        <w:u w:val="none"/>
+        <w:shd w:fill="auto" w:val="clear"/>
+        <w:vertAlign w:val="baseline"/>
+      </w:rPr>
+      <w:fldChar w:fldCharType="separate"/>
+    </w:r>
+    <w:r>
+      <w:rPr>
+        <w:rFonts w:ascii="Calibri" w:cs="Calibri" w:eastAsia="Calibri" w:hAnsi="Calibri"/>
+        <w:b w:val="0"/>
+        <w:bCs w:val="0"/>
+        <w:i w:val="0"/>
+        <w:iCs w:val="0"/>
+        <w:smallCaps w:val="0"/>
+        <w:strike w:val="0"/>
+        <w:color w:val="000000"/>
+        <w:sz w:val="22"/>
+        <w:szCs w:val="22"/>
+        <w:u w:val="none"/>
+        <w:shd w:fill="auto" w:val="clear"/>
+        <w:vertAlign w:val="baseline"/>
+      </w:rPr>
+      <w:t>1</w:t>
+    </w:r>
+    <w:r>
+      <w:rPr>
+        <w:rFonts w:ascii="Calibri" w:cs="Calibri" w:eastAsia="Calibri" w:hAnsi="Calibri"/>
+        <w:b w:val="0"/>
+        <w:bCs w:val="0"/>
+        <w:i w:val="0"/>
+        <w:iCs w:val="0"/>
+        <w:smallCaps w:val="0"/>
+        <w:strike w:val="0"/>
+        <w:color w:val="000000"/>
+        <w:sz w:val="22"/>
+        <w:szCs w:val="22"/>
+        <w:u w:val="none"/>
+        <w:shd w:fill="auto" w:val="clear"/>
+        <w:vertAlign w:val="baseline"/>
+      </w:rPr>
       <w:fldChar w:fldCharType="end"/>
     </w:r>
     <w:r>
@@ -5800,7 +5975,6 @@
     <w:pPr>
       <w:keepNext w:val="0"/>
       <w:keepLines w:val="0"/>
-      <w:pageBreakBefore w:val="0"/>
       <w:widowControl w:val="1"/>
       <w:pBdr>
         <w:top w:space="0" w:sz="0" w:val="nil"/>
@@ -6805,6 +6979,59 @@
       <w:sz w:val="72"/>
       <w:szCs w:val="72"/>
     </w:rPr>
+  </w:style>
+  <w:style w:type="table" w:styleId="TableNormal" w:default="1">
+    <w:name w:val="TableNormal"/>
+    <w:tblPr>
+      <w:tblCellMar>
+        <w:top w:w="100.0" w:type="dxa"/>
+        <w:left w:w="100.0" w:type="dxa"/>
+        <w:bottom w:w="100.0" w:type="dxa"/>
+        <w:right w:w="100.0" w:type="dxa"/>
+      </w:tblCellMar>
+    </w:tblPr>
+  </w:style>
+  <w:style w:type="paragraph" w:styleId="Normal" w:default="1">
+    <w:name w:val="normal"/>
+  </w:style>
+  <w:style w:type="table" w:styleId="Table1">
+    <w:basedOn w:val="TableNormal"/>
+    <w:tblPr>
+      <w:tblStyleRowBandSize w:val="1"/>
+      <w:tblStyleColBandSize w:val="1"/>
+      <w:tblCellMar>
+        <w:top w:w="15.0" w:type="dxa"/>
+        <w:left w:w="15.0" w:type="dxa"/>
+        <w:bottom w:w="15.0" w:type="dxa"/>
+        <w:right w:w="15.0" w:type="dxa"/>
+      </w:tblCellMar>
+    </w:tblPr>
+  </w:style>
+  <w:style w:type="table" w:styleId="Table2">
+    <w:basedOn w:val="TableNormal"/>
+    <w:tblPr>
+      <w:tblStyleRowBandSize w:val="1"/>
+      <w:tblStyleColBandSize w:val="1"/>
+      <w:tblCellMar>
+        <w:top w:w="15.0" w:type="dxa"/>
+        <w:left w:w="15.0" w:type="dxa"/>
+        <w:bottom w:w="15.0" w:type="dxa"/>
+        <w:right w:w="15.0" w:type="dxa"/>
+      </w:tblCellMar>
+    </w:tblPr>
+  </w:style>
+  <w:style w:type="table" w:styleId="Table3">
+    <w:basedOn w:val="TableNormal"/>
+    <w:tblPr>
+      <w:tblStyleRowBandSize w:val="1"/>
+      <w:tblStyleColBandSize w:val="1"/>
+      <w:tblCellMar>
+        <w:top w:w="15.0" w:type="dxa"/>
+        <w:left w:w="15.0" w:type="dxa"/>
+        <w:bottom w:w="15.0" w:type="dxa"/>
+        <w:right w:w="15.0" w:type="dxa"/>
+      </w:tblCellMar>
+    </w:tblPr>
   </w:style>
   <w:style w:type="paragraph" w:styleId="Subtitle">
     <w:name w:val="Subtitle"/>
@@ -7185,4 +7412,19 @@
   </a:objectDefaults>
   <a:extraClrSchemeLst/>
 </a:theme>
+</file>
+
+<file path=customXML/item1.xml><?xml version="1.0" encoding="utf-8"?>
+<go:gDocsCustomXmlDataStorage xmlns:go="http://customooxmlschemas.google.com/" xmlns:r="http://schemas.openxmlformats.org/officeDocument/2006/relationships" uri="GoogleDocsCustomDataVersion2">
+  <go:docsCustomData xmlns:go="http://customooxmlschemas.google.com/" roundtripDataSignature="AMtx7mhmbpsa2oXDrXl60p6Tz5xsMlpoxQ==">CgMxLjAyDmgueTN2MzR5ajhlaGlsOAByITE3YjZGQnlWQldsN25SMGcyS0JqX21rTk9lUmlXdjF1cA==</go:docsCustomData>
+</go:gDocsCustomXmlDataStorage>
+</file>
+
+<file path=customXML/itemProps1.xml><?xml version="1.0" encoding="utf-8"?>
+<ds:datastoreItem xmlns:ds="http://schemas.openxmlformats.org/officeDocument/2006/customXml" ds:itemID="{11111111-1234-1234-1234-123412341234}">
+  <ds:schemaRefs>
+    <ds:schemaRef ds:uri="http://schemas.openxmlformats.org/officeDocument/2006/relationships"/>
+    <ds:schemaRef ds:uri="http://customooxmlschemas.google.com/"/>
+  </ds:schemaRefs>
+</ds:datastoreItem>
 </file>
</xml_diff>

<commit_message>
Remove return location details from rental contracts and add child seat selection on website (6aca81dcc15e4ad9d165558d)
</commit_message>
<xml_diff>
--- a/contract/dogovor-shablon.docx
+++ b/contract/dogovor-shablon.docx
@@ -3900,11 +3900,11 @@
         <w:rPr>
           <w:rtl w:val="0"/>
         </w:rPr>
-        <w:t xml:space="preserve">Дата: {{d2}} г.</w:t>
+        <w:t xml:space="preserve">Дата: {{returnDate}} г.</w:t>
         <w:br w:type="textWrapping"/>
-        <w:t xml:space="preserve">Час: {{t2}} ч.</w:t>
+        <w:t xml:space="preserve">Час: {{returnTime}} ч.</w:t>
         <w:br w:type="textWrapping"/>
-        <w:t xml:space="preserve">Адрес: {{returnPlace}}</w:t>
+        <w:t xml:space="preserve">Адрес: {{returnAddress}}</w:t>
       </w:r>
     </w:p>
     <w:p>

</xml_diff>

<commit_message>
Update contract to reflect changes in deposit and additional services (6aca90dffb5a9c8f6951ff7d)
</commit_message>
<xml_diff>
--- a/contract/dogovor-shablon.docx
+++ b/contract/dogovor-shablon.docx
@@ -651,6 +651,37 @@
     </w:p>
     <w:p>
       <w:pPr>
+        <w:keepNext/>
+        <w:rPr>
+          <w:b w:val="1"/>
+          <w:bCs w:val="1"/>
+        </w:rPr>
+      </w:pPr>
+      <w:r>
+        <w:rPr>
+          <w:b w:val="1"/>
+          <w:bCs w:val="1"/>
+          <w:rtl w:val="0"/>
+        </w:rPr>
+        <w:t xml:space="preserve">Чл. 4а.</w:t>
+      </w:r>
+      <w:r>
+        <w:rPr>
+          <w:rtl w:val="0"/>
+        </w:rPr>
+        <w:t xml:space="preserve"> </w:t>
+      </w:r>
+      <w:r>
+        <w:rPr>
+          <w:b w:val="1"/>
+          <w:bCs w:val="1"/>
+          <w:rtl w:val="0"/>
+        </w:rPr>
+        <w:t xml:space="preserve">Допълнителни услуги</w:t>
+      </w:r>
+    </w:p>
+    <w:p>
+      <w:pPr>
         <w:numPr>
           <w:ilvl w:val="0"/>
           <w:numId w:val="4"/>
@@ -852,7 +883,7 @@
           <w:bCs w:val="1"/>
           <w:rtl w:val="0"/>
         </w:rPr>
-        <w:t xml:space="preserve">Чл. 4а.</w:t>
+        <w:t xml:space="preserve">Чл. 4б.</w:t>
       </w:r>
       <w:r>
         <w:rPr>
@@ -2420,7 +2451,7 @@
         <w:rPr>
           <w:rtl w:val="0"/>
         </w:rPr>
-        <w:t xml:space="preserve">Договорът, Приемо-предавателният протокол и Декларацията по чл. 4а са неразделни части от правоотношението.</w:t>
+        <w:t xml:space="preserve">Договорът, Приемо-предавателният протокол и Декларацията по чл. 4б са неразделни части от правоотношението.</w:t>
       </w:r>
     </w:p>
     <w:p>

</xml_diff>

<commit_message>
Add names to appendix signatures and dynamic total pages in Article 16
</commit_message>
<xml_diff>
--- a/contract/dogovor-shablon.docx
+++ b/contract/dogovor-shablon.docx
@@ -2414,10 +2414,6 @@
     </w:p>
     <w:p>
       <w:pPr>
-        <w:numPr>
-          <w:ilvl w:val="0"/>
-          <w:numId w:val="6"/>
-        </w:numPr>
         <w:ind w:left="720" w:hanging="360"/>
         <w:rPr/>
       </w:pPr>
@@ -2425,25 +2421,21 @@
         <w:rPr>
           <w:rtl w:val="0"/>
         </w:rPr>
-        <w:t xml:space="preserve">Договорът се съставя в два екземпляра – по един за всяка страна. </w:t>
-      </w:r>
-    </w:p>
-    <w:p>
-      <w:pPr>
-        <w:rPr/>
-      </w:pPr>
-      <w:r>
-        <w:rPr>
-          <w:rtl w:val="0"/>
-        </w:rPr>
-      </w:r>
-    </w:p>
-    <w:p>
-      <w:pPr>
-        <w:numPr>
-          <w:ilvl w:val="0"/>
-          <w:numId w:val="6"/>
-        </w:numPr>
+        <w:t xml:space="preserve">1. Договорът се съставя в два екземпляра – по един за всяка страна. </w:t>
+      </w:r>
+    </w:p>
+    <w:p>
+      <w:pPr>
+        <w:rPr/>
+      </w:pPr>
+      <w:r>
+        <w:rPr>
+          <w:rtl w:val="0"/>
+        </w:rPr>
+      </w:r>
+    </w:p>
+    <w:p>
+      <w:pPr>
         <w:ind w:left="720" w:hanging="360"/>
         <w:rPr/>
       </w:pPr>
@@ -2451,7 +2443,7 @@
         <w:rPr>
           <w:rtl w:val="0"/>
         </w:rPr>
-        <w:t xml:space="preserve">Договорът, Приемо-предавателният протокол и Декларацията по чл. 4б са неразделни части от правоотношението.</w:t>
+        <w:t xml:space="preserve">2. Договорът, Приемо-предавателният протокол и Декларацията по чл. 4б са неразделни части от правоотношението.</w:t>
       </w:r>
     </w:p>
     <w:p>
@@ -2467,10 +2459,6 @@
     </w:p>
     <w:p>
       <w:pPr>
-        <w:numPr>
-          <w:ilvl w:val="0"/>
-          <w:numId w:val="6"/>
-        </w:numPr>
         <w:ind w:left="720" w:hanging="360"/>
         <w:rPr/>
       </w:pPr>
@@ -2478,7 +2466,15 @@
         <w:rPr>
           <w:rtl w:val="0"/>
         </w:rPr>
-        <w:t xml:space="preserve">Документите, включително приложенията към тях, са последователно номерирани.</w:t>
+        <w:t xml:space="preserve">3. Документите, включително приложенията към тях, са с общ обем от </w:t>
+      </w:r>
+      <w:fldSimple w:instr=" NUMPAGES " w:dirty="true">
+        <w:r>
+          <w:t xml:space="preserve"> </w:t>
+        </w:r>
+      </w:fldSimple>
+      <w:r>
+        <w:t xml:space="preserve"> страници, последователно номерирани.</w:t>
       </w:r>
     </w:p>
     <w:tbl>

</xml_diff>